<commit_message>
Add PickyFoods landing page and name check
Co-Authored-By: Claude Opus 5.5 <noreply@anthropic.com>
</commit_message>
<xml_diff>
--- a/07_DietGroceryApp/ResearchNames/AppNames_Research.docx
+++ b/07_DietGroceryApp/ResearchNames/AppNames_Research.docx
@@ -2139,6 +2139,324 @@
       </w:r>
       <w:r>
         <w:t xml:space="preserve"> PANTROVE is a live mark in classes 9 and 42 (software).</w:t>
+      </w:r>
+    </w:p>
+    <w:p>
+      <w:pPr>
+        <w:pStyle w:val="Heading1"/>
+      </w:pPr>
+      <w:r>
+        <w:t xml:space="preserve">Update 2026-10-02: PickyFoods</w:t>
+      </w:r>
+    </w:p>
+    <w:p>
+      <w:r>
+        <w:t xml:space="preserve">The landing page now uses </w:t>
+      </w:r>
+      <w:r>
+        <w:rPr>
+          <w:b/>
+        </w:rPr>
+        <w:t xml:space="preserve">PickyFoods</w:t>
+      </w:r>
+      <w:r>
+        <w:t xml:space="preserve">, so the name got the same checks. The full results are in </w:t>
+      </w:r>
+      <w:r>
+        <w:rPr>
+          <w:rFonts w:ascii="Consolas" w:hAnsi="Consolas"/>
+        </w:rPr>
+        <w:t xml:space="preserve">name-check-pickyfoods.md</w:t>
+      </w:r>
+      <w:r>
+        <w:t xml:space="preserve">.</w:t>
+      </w:r>
+    </w:p>
+    <w:tbl>
+      <w:tblPr>
+        <w:tblW w:w="10080" w:type="dxa"/>
+        <w:tblBorders>
+          <w:top w:val="single" w:sz="4" w:space="0" w:color="C9CCD1"/>
+          <w:left w:val="single" w:sz="4" w:space="0" w:color="C9CCD1"/>
+          <w:bottom w:val="single" w:sz="4" w:space="0" w:color="C9CCD1"/>
+          <w:right w:val="single" w:sz="4" w:space="0" w:color="C9CCD1"/>
+          <w:insideH w:val="single" w:sz="4" w:space="0" w:color="C9CCD1"/>
+          <w:insideV w:val="single" w:sz="4" w:space="0" w:color="C9CCD1"/>
+        </w:tblBorders>
+        <w:tblLayout w:type="fixed"/>
+      </w:tblPr>
+      <w:tblGrid>
+        <w:gridCol w:w="5040"/>
+        <w:gridCol w:w="5040"/>
+      </w:tblGrid>
+      <w:tr>
+        <w:trPr>
+          <w:tblHeader/>
+        </w:trPr>
+        <w:tc>
+          <w:tcPr>
+            <w:tcW w:w="5040" w:type="dxa"/>
+            <w:shd w:val="clear" w:color="auto" w:fill="EFF1F3"/>
+          </w:tcPr>
+          <w:p>
+            <w:pPr>
+              <w:spacing w:before="40" w:after="40"/>
+            </w:pPr>
+            <w:r>
+              <w:rPr>
+                <w:b/>
+                <w:sz w:val="18"/>
+              </w:rPr>
+              <w:t xml:space="preserve">Check</w:t>
+            </w:r>
+          </w:p>
+        </w:tc>
+        <w:tc>
+          <w:tcPr>
+            <w:tcW w:w="5040" w:type="dxa"/>
+            <w:shd w:val="clear" w:color="auto" w:fill="EFF1F3"/>
+          </w:tcPr>
+          <w:p>
+            <w:pPr>
+              <w:spacing w:before="40" w:after="40"/>
+            </w:pPr>
+            <w:r>
+              <w:rPr>
+                <w:b/>
+                <w:sz w:val="18"/>
+              </w:rPr>
+              <w:t xml:space="preserve">Result</w:t>
+            </w:r>
+          </w:p>
+        </w:tc>
+      </w:tr>
+      <w:tr>
+        <w:tc>
+          <w:tcPr>
+            <w:tcW w:w="5040" w:type="dxa"/>
+          </w:tcPr>
+          <w:p>
+            <w:pPr>
+              <w:spacing w:before="40" w:after="40"/>
+            </w:pPr>
+            <w:r>
+              <w:rPr>
+                <w:sz w:val="18"/>
+              </w:rPr>
+              <w:t xml:space="preserve">App Store / Google Play, exact name</w:t>
+            </w:r>
+          </w:p>
+        </w:tc>
+        <w:tc>
+          <w:tcPr>
+            <w:tcW w:w="5040" w:type="dxa"/>
+          </w:tcPr>
+          <w:p>
+            <w:pPr>
+              <w:spacing w:before="40" w:after="40"/>
+            </w:pPr>
+            <w:r>
+              <w:rPr>
+                <w:sz w:val="18"/>
+              </w:rPr>
+              <w:t xml:space="preserve">No app called PickyFoods</w:t>
+            </w:r>
+          </w:p>
+        </w:tc>
+      </w:tr>
+      <w:tr>
+        <w:tc>
+          <w:tcPr>
+            <w:tcW w:w="5040" w:type="dxa"/>
+          </w:tcPr>
+          <w:p>
+            <w:pPr>
+              <w:spacing w:before="40" w:after="40"/>
+            </w:pPr>
+            <w:r>
+              <w:rPr>
+                <w:sz w:val="18"/>
+              </w:rPr>
+              <w:t xml:space="preserve">USPTO, exact name</w:t>
+            </w:r>
+          </w:p>
+        </w:tc>
+        <w:tc>
+          <w:tcPr>
+            <w:tcW w:w="5040" w:type="dxa"/>
+          </w:tcPr>
+          <w:p>
+            <w:pPr>
+              <w:spacing w:before="40" w:after="40"/>
+            </w:pPr>
+            <w:r>
+              <w:rPr>
+                <w:sz w:val="18"/>
+              </w:rPr>
+              <w:t xml:space="preserve">No live PICKYFOODS or PICKY FOODS mark</w:t>
+            </w:r>
+          </w:p>
+        </w:tc>
+      </w:tr>
+      <w:tr>
+        <w:tc>
+          <w:tcPr>
+            <w:tcW w:w="5040" w:type="dxa"/>
+          </w:tcPr>
+          <w:p>
+            <w:pPr>
+              <w:spacing w:before="40" w:after="40"/>
+            </w:pPr>
+            <w:r>
+              <w:rPr>
+                <w:sz w:val="18"/>
+              </w:rPr>
+              <w:t xml:space="preserve">pickyfoods.com</w:t>
+            </w:r>
+          </w:p>
+        </w:tc>
+        <w:tc>
+          <w:tcPr>
+            <w:tcW w:w="5040" w:type="dxa"/>
+          </w:tcPr>
+          <w:p>
+            <w:pPr>
+              <w:spacing w:before="40" w:after="40"/>
+            </w:pPr>
+            <w:r>
+              <w:rPr>
+                <w:b/>
+                <w:sz w:val="18"/>
+              </w:rPr>
+              <w:t xml:space="preserve">Taken.</w:t>
+            </w:r>
+            <w:r>
+              <w:rPr>
+                <w:sz w:val="18"/>
+              </w:rPr>
+              <w:t xml:space="preserve"> Registered since 2016 and renewed through 2031, with no live site</w:t>
+            </w:r>
+          </w:p>
+        </w:tc>
+      </w:tr>
+      <w:tr>
+        <w:tc>
+          <w:tcPr>
+            <w:tcW w:w="5040" w:type="dxa"/>
+          </w:tcPr>
+          <w:p>
+            <w:pPr>
+              <w:spacing w:before="40" w:after="40"/>
+            </w:pPr>
+            <w:r>
+              <w:rPr>
+                <w:sz w:val="18"/>
+              </w:rPr>
+              <w:t xml:space="preserve">pickyfoods.app, getpickyfoods.com</w:t>
+            </w:r>
+          </w:p>
+        </w:tc>
+        <w:tc>
+          <w:tcPr>
+            <w:tcW w:w="5040" w:type="dxa"/>
+          </w:tcPr>
+          <w:p>
+            <w:pPr>
+              <w:spacing w:before="40" w:after="40"/>
+            </w:pPr>
+            <w:r>
+              <w:rPr>
+                <w:sz w:val="18"/>
+              </w:rPr>
+              <w:t xml:space="preserve">Free</w:t>
+            </w:r>
+          </w:p>
+        </w:tc>
+      </w:tr>
+      <w:tr>
+        <w:tc>
+          <w:tcPr>
+            <w:tcW w:w="5040" w:type="dxa"/>
+          </w:tcPr>
+          <w:p>
+            <w:pPr>
+              <w:spacing w:before="40" w:after="40"/>
+            </w:pPr>
+            <w:r>
+              <w:rPr>
+                <w:sz w:val="18"/>
+              </w:rPr>
+              <w:t xml:space="preserve">Close conflicts</w:t>
+            </w:r>
+          </w:p>
+        </w:tc>
+        <w:tc>
+          <w:tcPr>
+            <w:tcW w:w="5040" w:type="dxa"/>
+          </w:tcPr>
+          <w:p>
+            <w:pPr>
+              <w:spacing w:before="40" w:after="40"/>
+            </w:pPr>
+            <w:r>
+              <w:rPr>
+                <w:sz w:val="18"/>
+              </w:rPr>
+              <w:t xml:space="preserve">Two pending class 9 trademark applications cover food and diet apps: </w:t>
+            </w:r>
+            <w:r>
+              <w:rPr>
+                <w:b/>
+                <w:sz w:val="18"/>
+              </w:rPr>
+              <w:t xml:space="preserve">PICKY?</w:t>
+            </w:r>
+            <w:r>
+              <w:rPr>
+                <w:sz w:val="18"/>
+              </w:rPr>
+              <w:t xml:space="preserve"> (dietary preferences and allergies) and </w:t>
+            </w:r>
+            <w:r>
+              <w:rPr>
+                <w:b/>
+                <w:sz w:val="18"/>
+              </w:rPr>
+              <w:t xml:space="preserve">PICKY CHEFS</w:t>
+            </w:r>
+            <w:r>
+              <w:rPr>
+                <w:sz w:val="18"/>
+              </w:rPr>
+              <w:t xml:space="preserve"> (recipes, meal plans and grocery lists). At least 20 US apps already use "Picky," including Eat Picky, Picky - What's for dinner?, Picky - Grocery Shopping List and Picky Plates.</w:t>
+            </w:r>
+          </w:p>
+        </w:tc>
+      </w:tr>
+    </w:tbl>
+    <w:p>
+      <w:pPr>
+        <w:spacing w:after="0"/>
+      </w:pPr>
+    </w:p>
+    <w:p>
+      <w:r>
+        <w:rPr>
+          <w:b/>
+        </w:rPr>
+        <w:t xml:space="preserve">Verdict:</w:t>
+      </w:r>
+      <w:r>
+        <w:t xml:space="preserve"> PickyFoods is not taken as an exact name, but the risk is </w:t>
+      </w:r>
+      <w:r>
+        <w:rPr>
+          <w:b/>
+        </w:rPr>
+        <w:t xml:space="preserve">medium to high</w:t>
+      </w:r>
+      <w:r>
+        <w:t xml:space="preserve">. "Picky" is crowded in this exact category, hard to trademark, and it reads as "picky eater" (kids and allergies) rather than weight loss. It's fine for a demo page, but it ranks below the two names recommended below.</w:t>
       </w:r>
     </w:p>
     <w:p>
@@ -12251,6 +12569,1783 @@
       <w:pPr>
         <w:spacing w:after="0"/>
       </w:pPr>
+    </w:p>
+    <w:p>
+      <w:r>
+        <w:br w:type="page"/>
+      </w:r>
+    </w:p>
+    <w:p>
+      <w:pPr>
+        <w:pStyle w:val="Title"/>
+      </w:pPr>
+      <w:r>
+        <w:t xml:space="preserve">Name Check: PickyFoods</w:t>
+      </w:r>
+    </w:p>
+    <w:p>
+      <w:r>
+        <w:rPr>
+          <w:b/>
+        </w:rPr>
+        <w:t xml:space="preserve">Date run:</w:t>
+      </w:r>
+      <w:r>
+        <w:t xml:space="preserve"> 2026-10-02 · </w:t>
+      </w:r>
+      <w:r>
+        <w:rPr>
+          <w:b/>
+        </w:rPr>
+        <w:t xml:space="preserve">Why:</w:t>
+      </w:r>
+      <w:r>
+        <w:t xml:space="preserve"> the landing page (</w:t>
+      </w:r>
+      <w:r>
+        <w:rPr>
+          <w:rFonts w:ascii="Consolas" w:hAnsi="Consolas"/>
+        </w:rPr>
+        <w:t xml:space="preserve">LandingPage/index.html</w:t>
+      </w:r>
+      <w:r>
+        <w:t xml:space="preserve">) now uses the name PickyFoods, which was not one of the 75 names in the first screen.</w:t>
+      </w:r>
+    </w:p>
+    <w:p>
+      <w:pPr>
+        <w:pStyle w:val="Heading1"/>
+      </w:pPr>
+      <w:r>
+        <w:t xml:space="preserve">Verdict</w:t>
+      </w:r>
+    </w:p>
+    <w:p>
+      <w:r>
+        <w:rPr>
+          <w:b/>
+        </w:rPr>
+        <w:t xml:space="preserve">PickyFoods is not taken as an exact name, but it sits in a crowded field and would be hard to protect.</w:t>
+      </w:r>
+      <w:r>
+        <w:t xml:space="preserve"> No app or live trademark uses the exact name, and pickyfoods.app is open. But pickyfoods.com has been registered since 2016. At least 20 US apps already use "Picky," many of them for food, and two pending trademark applications claim "PICKY" for food and diet apps. "Picky" also signals picky eaters and kids, which doesn't fit a weight-loss and GLP-1 audience.</w:t>
+      </w:r>
+    </w:p>
+    <w:p>
+      <w:r>
+        <w:rPr>
+          <w:b/>
+        </w:rPr>
+        <w:t xml:space="preserve">Risk rating: medium to high.</w:t>
+      </w:r>
+      <w:r>
+        <w:t xml:space="preserve"> That's fine for a class demo page. For a launch, it ranks below SatietyCart and HushPlate.</w:t>
+      </w:r>
+    </w:p>
+    <w:p>
+      <w:pPr>
+        <w:pStyle w:val="Heading1"/>
+      </w:pPr>
+      <w:r>
+        <w:t xml:space="preserve">Exact-name results</w:t>
+      </w:r>
+    </w:p>
+    <w:p>
+      <w:r>
+        <w:t xml:space="preserve">The same automated check as the first screen was used (</w:t>
+      </w:r>
+      <w:r>
+        <w:rPr>
+          <w:rFonts w:ascii="Consolas" w:hAnsi="Consolas"/>
+        </w:rPr>
+        <w:t xml:space="preserve">_tools_name-check.js</w:t>
+      </w:r>
+      <w:r>
+        <w:t xml:space="preserve">, raw output in </w:t>
+      </w:r>
+      <w:r>
+        <w:rPr>
+          <w:rFonts w:ascii="Consolas" w:hAnsi="Consolas"/>
+        </w:rPr>
+        <w:t xml:space="preserve">name-check-pickyfoods.json</w:t>
+      </w:r>
+      <w:r>
+        <w:t xml:space="preserve">). The spellings PickyFoods, Picky Foods, PickyFood and Picky Food were all checked.</w:t>
+      </w:r>
+    </w:p>
+    <w:tbl>
+      <w:tblPr>
+        <w:tblW w:w="10080" w:type="dxa"/>
+        <w:tblBorders>
+          <w:top w:val="single" w:sz="4" w:space="0" w:color="C9CCD1"/>
+          <w:left w:val="single" w:sz="4" w:space="0" w:color="C9CCD1"/>
+          <w:bottom w:val="single" w:sz="4" w:space="0" w:color="C9CCD1"/>
+          <w:right w:val="single" w:sz="4" w:space="0" w:color="C9CCD1"/>
+          <w:insideH w:val="single" w:sz="4" w:space="0" w:color="C9CCD1"/>
+          <w:insideV w:val="single" w:sz="4" w:space="0" w:color="C9CCD1"/>
+        </w:tblBorders>
+        <w:tblLayout w:type="fixed"/>
+      </w:tblPr>
+      <w:tblGrid>
+        <w:gridCol w:w="3360"/>
+        <w:gridCol w:w="3360"/>
+        <w:gridCol w:w="3360"/>
+      </w:tblGrid>
+      <w:tr>
+        <w:trPr>
+          <w:tblHeader/>
+        </w:trPr>
+        <w:tc>
+          <w:tcPr>
+            <w:tcW w:w="3360" w:type="dxa"/>
+            <w:shd w:val="clear" w:color="auto" w:fill="EFF1F3"/>
+          </w:tcPr>
+          <w:p>
+            <w:pPr>
+              <w:spacing w:before="40" w:after="40"/>
+            </w:pPr>
+            <w:r>
+              <w:rPr>
+                <w:b/>
+                <w:sz w:val="18"/>
+              </w:rPr>
+              <w:t xml:space="preserve">Check</w:t>
+            </w:r>
+          </w:p>
+        </w:tc>
+        <w:tc>
+          <w:tcPr>
+            <w:tcW w:w="3360" w:type="dxa"/>
+            <w:shd w:val="clear" w:color="auto" w:fill="EFF1F3"/>
+          </w:tcPr>
+          <w:p>
+            <w:pPr>
+              <w:spacing w:before="40" w:after="40"/>
+            </w:pPr>
+            <w:r>
+              <w:rPr>
+                <w:b/>
+                <w:sz w:val="18"/>
+              </w:rPr>
+              <w:t xml:space="preserve">Result</w:t>
+            </w:r>
+          </w:p>
+        </w:tc>
+        <w:tc>
+          <w:tcPr>
+            <w:tcW w:w="3360" w:type="dxa"/>
+            <w:shd w:val="clear" w:color="auto" w:fill="EFF1F3"/>
+          </w:tcPr>
+          <w:p>
+            <w:pPr>
+              <w:spacing w:before="40" w:after="40"/>
+            </w:pPr>
+            <w:r>
+              <w:rPr>
+                <w:b/>
+                <w:sz w:val="18"/>
+              </w:rPr>
+              <w:t xml:space="preserve">Source</w:t>
+            </w:r>
+          </w:p>
+        </w:tc>
+      </w:tr>
+      <w:tr>
+        <w:tc>
+          <w:tcPr>
+            <w:tcW w:w="3360" w:type="dxa"/>
+          </w:tcPr>
+          <w:p>
+            <w:pPr>
+              <w:spacing w:before="40" w:after="40"/>
+            </w:pPr>
+            <w:r>
+              <w:rPr>
+                <w:sz w:val="18"/>
+              </w:rPr>
+              <w:t xml:space="preserve">Apple App Store (US)</w:t>
+            </w:r>
+          </w:p>
+        </w:tc>
+        <w:tc>
+          <w:tcPr>
+            <w:tcW w:w="3360" w:type="dxa"/>
+          </w:tcPr>
+          <w:p>
+            <w:pPr>
+              <w:spacing w:before="40" w:after="40"/>
+            </w:pPr>
+            <w:r>
+              <w:rPr>
+                <w:sz w:val="18"/>
+              </w:rPr>
+              <w:t xml:space="preserve">No app named PickyFoods or Picky Foods. "Picky Food" only matched "Picky: Food Ingredient Scanner."</w:t>
+            </w:r>
+          </w:p>
+        </w:tc>
+        <w:tc>
+          <w:tcPr>
+            <w:tcW w:w="3360" w:type="dxa"/>
+          </w:tcPr>
+          <w:p>
+            <w:pPr>
+              <w:spacing w:before="40" w:after="40"/>
+            </w:pPr>
+            <w:hyperlink r:id="rHl12">
+              <w:r>
+                <w:rPr>
+                  <w:rStyle w:val="Hyperlink"/>
+                  <w:sz w:val="18"/>
+                </w:rPr>
+                <w:t xml:space="preserve">iTunes Search API</w:t>
+              </w:r>
+            </w:hyperlink>
+          </w:p>
+        </w:tc>
+      </w:tr>
+      <w:tr>
+        <w:tc>
+          <w:tcPr>
+            <w:tcW w:w="3360" w:type="dxa"/>
+          </w:tcPr>
+          <w:p>
+            <w:pPr>
+              <w:spacing w:before="40" w:after="40"/>
+            </w:pPr>
+            <w:r>
+              <w:rPr>
+                <w:sz w:val="18"/>
+              </w:rPr>
+              <w:t xml:space="preserve">Google Play (US)</w:t>
+            </w:r>
+          </w:p>
+        </w:tc>
+        <w:tc>
+          <w:tcPr>
+            <w:tcW w:w="3360" w:type="dxa"/>
+          </w:tcPr>
+          <w:p>
+            <w:pPr>
+              <w:spacing w:before="40" w:after="40"/>
+            </w:pPr>
+            <w:r>
+              <w:rPr>
+                <w:sz w:val="18"/>
+              </w:rPr>
+              <w:t xml:space="preserve">No match</w:t>
+            </w:r>
+          </w:p>
+        </w:tc>
+        <w:tc>
+          <w:tcPr>
+            <w:tcW w:w="3360" w:type="dxa"/>
+          </w:tcPr>
+          <w:p>
+            <w:pPr>
+              <w:spacing w:before="40" w:after="40"/>
+            </w:pPr>
+            <w:hyperlink r:id="rHl13">
+              <w:r>
+                <w:rPr>
+                  <w:rStyle w:val="Hyperlink"/>
+                  <w:sz w:val="18"/>
+                </w:rPr>
+                <w:t xml:space="preserve">Play Store search</w:t>
+              </w:r>
+            </w:hyperlink>
+          </w:p>
+        </w:tc>
+      </w:tr>
+      <w:tr>
+        <w:tc>
+          <w:tcPr>
+            <w:tcW w:w="3360" w:type="dxa"/>
+          </w:tcPr>
+          <w:p>
+            <w:pPr>
+              <w:spacing w:before="40" w:after="40"/>
+            </w:pPr>
+            <w:r>
+              <w:rPr>
+                <w:sz w:val="18"/>
+              </w:rPr>
+              <w:t xml:space="preserve">USPTO, exact live mark</w:t>
+            </w:r>
+          </w:p>
+        </w:tc>
+        <w:tc>
+          <w:tcPr>
+            <w:tcW w:w="3360" w:type="dxa"/>
+          </w:tcPr>
+          <w:p>
+            <w:pPr>
+              <w:spacing w:before="40" w:after="40"/>
+            </w:pPr>
+            <w:r>
+              <w:rPr>
+                <w:sz w:val="18"/>
+              </w:rPr>
+              <w:t xml:space="preserve">None for PICKYFOODS, PICKY FOODS or PICKY FOOD, including a fuzzy pass with edit distance 1</w:t>
+            </w:r>
+          </w:p>
+        </w:tc>
+        <w:tc>
+          <w:tcPr>
+            <w:tcW w:w="3360" w:type="dxa"/>
+          </w:tcPr>
+          <w:p>
+            <w:pPr>
+              <w:spacing w:before="40" w:after="40"/>
+            </w:pPr>
+            <w:hyperlink r:id="rHl3">
+              <w:r>
+                <w:rPr>
+                  <w:rStyle w:val="Hyperlink"/>
+                  <w:sz w:val="18"/>
+                </w:rPr>
+                <w:t xml:space="preserve">USPTO Trademark Search</w:t>
+              </w:r>
+            </w:hyperlink>
+          </w:p>
+        </w:tc>
+      </w:tr>
+      <w:tr>
+        <w:tc>
+          <w:tcPr>
+            <w:tcW w:w="3360" w:type="dxa"/>
+          </w:tcPr>
+          <w:p>
+            <w:pPr>
+              <w:spacing w:before="40" w:after="40"/>
+            </w:pPr>
+            <w:r>
+              <w:rPr>
+                <w:sz w:val="18"/>
+              </w:rPr>
+              <w:t xml:space="preserve">pickyfoods.com</w:t>
+            </w:r>
+          </w:p>
+        </w:tc>
+        <w:tc>
+          <w:tcPr>
+            <w:tcW w:w="3360" w:type="dxa"/>
+          </w:tcPr>
+          <w:p>
+            <w:pPr>
+              <w:spacing w:before="40" w:after="40"/>
+            </w:pPr>
+            <w:r>
+              <w:rPr>
+                <w:b/>
+                <w:sz w:val="18"/>
+              </w:rPr>
+              <w:t xml:space="preserve">Taken.</w:t>
+            </w:r>
+            <w:r>
+              <w:rPr>
+                <w:sz w:val="18"/>
+              </w:rPr>
+              <w:t xml:space="preserve"> Registered at GoDaddy on 2016-07-12 and renewed through 2031-07-12. It points at Wix but shows a Wix "connect your domain" error page, so there's no live site.</w:t>
+            </w:r>
+          </w:p>
+        </w:tc>
+        <w:tc>
+          <w:tcPr>
+            <w:tcW w:w="3360" w:type="dxa"/>
+          </w:tcPr>
+          <w:p>
+            <w:pPr>
+              <w:spacing w:before="40" w:after="40"/>
+            </w:pPr>
+            <w:hyperlink r:id="rHl14">
+              <w:r>
+                <w:rPr>
+                  <w:rStyle w:val="Hyperlink"/>
+                  <w:sz w:val="18"/>
+                </w:rPr>
+                <w:t xml:space="preserve">Verisign RDAP</w:t>
+              </w:r>
+            </w:hyperlink>
+          </w:p>
+        </w:tc>
+      </w:tr>
+      <w:tr>
+        <w:tc>
+          <w:tcPr>
+            <w:tcW w:w="3360" w:type="dxa"/>
+          </w:tcPr>
+          <w:p>
+            <w:pPr>
+              <w:spacing w:before="40" w:after="40"/>
+            </w:pPr>
+            <w:r>
+              <w:rPr>
+                <w:sz w:val="18"/>
+              </w:rPr>
+              <w:t xml:space="preserve">pickyfoods.app</w:t>
+            </w:r>
+          </w:p>
+        </w:tc>
+        <w:tc>
+          <w:tcPr>
+            <w:tcW w:w="3360" w:type="dxa"/>
+          </w:tcPr>
+          <w:p>
+            <w:pPr>
+              <w:spacing w:before="40" w:after="40"/>
+            </w:pPr>
+            <w:r>
+              <w:rPr>
+                <w:sz w:val="18"/>
+              </w:rPr>
+              <w:t xml:space="preserve">Free</w:t>
+            </w:r>
+          </w:p>
+        </w:tc>
+        <w:tc>
+          <w:tcPr>
+            <w:tcW w:w="3360" w:type="dxa"/>
+          </w:tcPr>
+          <w:p>
+            <w:pPr>
+              <w:spacing w:before="40" w:after="40"/>
+            </w:pPr>
+            <w:hyperlink r:id="rHl15">
+              <w:r>
+                <w:rPr>
+                  <w:rStyle w:val="Hyperlink"/>
+                  <w:sz w:val="18"/>
+                </w:rPr>
+                <w:t xml:space="preserve">Google Registry RDAP</w:t>
+              </w:r>
+            </w:hyperlink>
+          </w:p>
+        </w:tc>
+      </w:tr>
+      <w:tr>
+        <w:tc>
+          <w:tcPr>
+            <w:tcW w:w="3360" w:type="dxa"/>
+          </w:tcPr>
+          <w:p>
+            <w:pPr>
+              <w:spacing w:before="40" w:after="40"/>
+            </w:pPr>
+            <w:r>
+              <w:rPr>
+                <w:sz w:val="18"/>
+              </w:rPr>
+              <w:t xml:space="preserve">getpickyfoods.com</w:t>
+            </w:r>
+          </w:p>
+        </w:tc>
+        <w:tc>
+          <w:tcPr>
+            <w:tcW w:w="3360" w:type="dxa"/>
+          </w:tcPr>
+          <w:p>
+            <w:pPr>
+              <w:spacing w:before="40" w:after="40"/>
+            </w:pPr>
+            <w:r>
+              <w:rPr>
+                <w:sz w:val="18"/>
+              </w:rPr>
+              <w:t xml:space="preserve">Free</w:t>
+            </w:r>
+          </w:p>
+        </w:tc>
+        <w:tc>
+          <w:tcPr>
+            <w:tcW w:w="3360" w:type="dxa"/>
+          </w:tcPr>
+          <w:p>
+            <w:pPr>
+              <w:spacing w:before="40" w:after="40"/>
+            </w:pPr>
+            <w:hyperlink r:id="rHl16">
+              <w:r>
+                <w:rPr>
+                  <w:rStyle w:val="Hyperlink"/>
+                  <w:sz w:val="18"/>
+                </w:rPr>
+                <w:t xml:space="preserve">Verisign RDAP</w:t>
+              </w:r>
+            </w:hyperlink>
+          </w:p>
+        </w:tc>
+      </w:tr>
+      <w:tr>
+        <w:tc>
+          <w:tcPr>
+            <w:tcW w:w="3360" w:type="dxa"/>
+          </w:tcPr>
+          <w:p>
+            <w:pPr>
+              <w:spacing w:before="40" w:after="40"/>
+            </w:pPr>
+            <w:r>
+              <w:rPr>
+                <w:sz w:val="18"/>
+              </w:rPr>
+              <w:t xml:space="preserve">Web search</w:t>
+            </w:r>
+          </w:p>
+        </w:tc>
+        <w:tc>
+          <w:tcPr>
+            <w:tcW w:w="3360" w:type="dxa"/>
+          </w:tcPr>
+          <w:p>
+            <w:pPr>
+              <w:spacing w:before="40" w:after="40"/>
+            </w:pPr>
+            <w:r>
+              <w:rPr>
+                <w:sz w:val="18"/>
+              </w:rPr>
+              <w:t xml:space="preserve">No company or product called PickyFoods. Results were picky-eating apps for children.</w:t>
+            </w:r>
+          </w:p>
+        </w:tc>
+        <w:tc>
+          <w:tcPr>
+            <w:tcW w:w="3360" w:type="dxa"/>
+          </w:tcPr>
+          <w:p>
+            <w:pPr>
+              <w:spacing w:before="40" w:after="40"/>
+            </w:pPr>
+            <w:hyperlink r:id="rHl17">
+              <w:r>
+                <w:rPr>
+                  <w:rStyle w:val="Hyperlink"/>
+                  <w:sz w:val="18"/>
+                </w:rPr>
+                <w:t xml:space="preserve">Picky Chefs</w:t>
+              </w:r>
+            </w:hyperlink>
+            <w:r>
+              <w:rPr>
+                <w:sz w:val="18"/>
+              </w:rPr>
+              <w:t xml:space="preserve">, </w:t>
+            </w:r>
+            <w:hyperlink r:id="rHl18">
+              <w:r>
+                <w:rPr>
+                  <w:rStyle w:val="Hyperlink"/>
+                  <w:sz w:val="18"/>
+                </w:rPr>
+                <w:t xml:space="preserve">NYU Langone picky eating app</w:t>
+              </w:r>
+            </w:hyperlink>
+          </w:p>
+        </w:tc>
+      </w:tr>
+    </w:tbl>
+    <w:p>
+      <w:pPr>
+        <w:spacing w:after="0"/>
+      </w:pPr>
+    </w:p>
+    <w:p>
+      <w:pPr>
+        <w:pStyle w:val="Heading1"/>
+      </w:pPr>
+      <w:r>
+        <w:t xml:space="preserve">Trademarks that could block it</w:t>
+      </w:r>
+    </w:p>
+    <w:p>
+      <w:r>
+        <w:t xml:space="preserve">The USPTO search for "PICKY*" returned 66 live marks. The word FOODS is generic, so an examiner would likely compare PICKY FOODS to these on the word PICKY alone. The ones that matter are in class 9 (app software) for food or diet uses:</w:t>
+      </w:r>
+    </w:p>
+    <w:tbl>
+      <w:tblPr>
+        <w:tblW w:w="10080" w:type="dxa"/>
+        <w:tblBorders>
+          <w:top w:val="single" w:sz="4" w:space="0" w:color="C9CCD1"/>
+          <w:left w:val="single" w:sz="4" w:space="0" w:color="C9CCD1"/>
+          <w:bottom w:val="single" w:sz="4" w:space="0" w:color="C9CCD1"/>
+          <w:right w:val="single" w:sz="4" w:space="0" w:color="C9CCD1"/>
+          <w:insideH w:val="single" w:sz="4" w:space="0" w:color="C9CCD1"/>
+          <w:insideV w:val="single" w:sz="4" w:space="0" w:color="C9CCD1"/>
+        </w:tblBorders>
+        <w:tblLayout w:type="fixed"/>
+      </w:tblPr>
+      <w:tblGrid>
+        <w:gridCol w:w="1680"/>
+        <w:gridCol w:w="1680"/>
+        <w:gridCol w:w="1680"/>
+        <w:gridCol w:w="1680"/>
+        <w:gridCol w:w="1680"/>
+        <w:gridCol w:w="1680"/>
+      </w:tblGrid>
+      <w:tr>
+        <w:trPr>
+          <w:tblHeader/>
+        </w:trPr>
+        <w:tc>
+          <w:tcPr>
+            <w:tcW w:w="1680" w:type="dxa"/>
+            <w:shd w:val="clear" w:color="auto" w:fill="EFF1F3"/>
+          </w:tcPr>
+          <w:p>
+            <w:pPr>
+              <w:spacing w:before="40" w:after="40"/>
+            </w:pPr>
+            <w:r>
+              <w:rPr>
+                <w:b/>
+                <w:sz w:val="18"/>
+              </w:rPr>
+              <w:t xml:space="preserve">Mark</w:t>
+            </w:r>
+          </w:p>
+        </w:tc>
+        <w:tc>
+          <w:tcPr>
+            <w:tcW w:w="1680" w:type="dxa"/>
+            <w:shd w:val="clear" w:color="auto" w:fill="EFF1F3"/>
+          </w:tcPr>
+          <w:p>
+            <w:pPr>
+              <w:spacing w:before="40" w:after="40"/>
+            </w:pPr>
+            <w:r>
+              <w:rPr>
+                <w:b/>
+                <w:sz w:val="18"/>
+              </w:rPr>
+              <w:t xml:space="preserve">Classes</w:t>
+            </w:r>
+          </w:p>
+        </w:tc>
+        <w:tc>
+          <w:tcPr>
+            <w:tcW w:w="1680" w:type="dxa"/>
+            <w:shd w:val="clear" w:color="auto" w:fill="EFF1F3"/>
+          </w:tcPr>
+          <w:p>
+            <w:pPr>
+              <w:spacing w:before="40" w:after="40"/>
+            </w:pPr>
+            <w:r>
+              <w:rPr>
+                <w:b/>
+                <w:sz w:val="18"/>
+              </w:rPr>
+              <w:t xml:space="preserve">Owner</w:t>
+            </w:r>
+          </w:p>
+        </w:tc>
+        <w:tc>
+          <w:tcPr>
+            <w:tcW w:w="1680" w:type="dxa"/>
+            <w:shd w:val="clear" w:color="auto" w:fill="EFF1F3"/>
+          </w:tcPr>
+          <w:p>
+            <w:pPr>
+              <w:spacing w:before="40" w:after="40"/>
+            </w:pPr>
+            <w:r>
+              <w:rPr>
+                <w:b/>
+                <w:sz w:val="18"/>
+              </w:rPr>
+              <w:t xml:space="preserve">What it covers</w:t>
+            </w:r>
+          </w:p>
+        </w:tc>
+        <w:tc>
+          <w:tcPr>
+            <w:tcW w:w="1680" w:type="dxa"/>
+            <w:shd w:val="clear" w:color="auto" w:fill="EFF1F3"/>
+          </w:tcPr>
+          <w:p>
+            <w:pPr>
+              <w:spacing w:before="40" w:after="40"/>
+            </w:pPr>
+            <w:r>
+              <w:rPr>
+                <w:b/>
+                <w:sz w:val="18"/>
+              </w:rPr>
+              <w:t xml:space="preserve">Status</w:t>
+            </w:r>
+          </w:p>
+        </w:tc>
+        <w:tc>
+          <w:tcPr>
+            <w:tcW w:w="1680" w:type="dxa"/>
+            <w:shd w:val="clear" w:color="auto" w:fill="EFF1F3"/>
+          </w:tcPr>
+          <w:p>
+            <w:pPr>
+              <w:spacing w:before="40" w:after="40"/>
+            </w:pPr>
+            <w:r>
+              <w:rPr>
+                <w:b/>
+                <w:sz w:val="18"/>
+              </w:rPr>
+              <w:t xml:space="preserve">Risk</w:t>
+            </w:r>
+          </w:p>
+        </w:tc>
+      </w:tr>
+      <w:tr>
+        <w:tc>
+          <w:tcPr>
+            <w:tcW w:w="1680" w:type="dxa"/>
+          </w:tcPr>
+          <w:p>
+            <w:pPr>
+              <w:spacing w:before="40" w:after="40"/>
+            </w:pPr>
+            <w:r>
+              <w:rPr>
+                <w:b/>
+                <w:sz w:val="18"/>
+              </w:rPr>
+              <w:t xml:space="preserve">PICKY?</w:t>
+            </w:r>
+          </w:p>
+        </w:tc>
+        <w:tc>
+          <w:tcPr>
+            <w:tcW w:w="1680" w:type="dxa"/>
+          </w:tcPr>
+          <w:p>
+            <w:pPr>
+              <w:spacing w:before="40" w:after="40"/>
+            </w:pPr>
+            <w:r>
+              <w:rPr>
+                <w:sz w:val="18"/>
+              </w:rPr>
+              <w:t xml:space="preserve">9</w:t>
+            </w:r>
+          </w:p>
+        </w:tc>
+        <w:tc>
+          <w:tcPr>
+            <w:tcW w:w="1680" w:type="dxa"/>
+          </w:tcPr>
+          <w:p>
+            <w:pPr>
+              <w:spacing w:before="40" w:after="40"/>
+            </w:pPr>
+            <w:r>
+              <w:rPr>
+                <w:sz w:val="18"/>
+              </w:rPr>
+              <w:t xml:space="preserve">Karen Sackett Akins</w:t>
+            </w:r>
+          </w:p>
+        </w:tc>
+        <w:tc>
+          <w:tcPr>
+            <w:tcW w:w="1680" w:type="dxa"/>
+          </w:tcPr>
+          <w:p>
+            <w:pPr>
+              <w:spacing w:before="40" w:after="40"/>
+            </w:pPr>
+            <w:r>
+              <w:rPr>
+                <w:sz w:val="18"/>
+              </w:rPr>
+              <w:t xml:space="preserve">Phone app software "for management and sharing information of dietary preferences and allergies"</w:t>
+            </w:r>
+          </w:p>
+        </w:tc>
+        <w:tc>
+          <w:tcPr>
+            <w:tcW w:w="1680" w:type="dxa"/>
+          </w:tcPr>
+          <w:p>
+            <w:pPr>
+              <w:spacing w:before="40" w:after="40"/>
+            </w:pPr>
+            <w:r>
+              <w:rPr>
+                <w:sz w:val="18"/>
+              </w:rPr>
+              <w:t xml:space="preserve">Pending (filed 2025-07-25). It's tied to the App Store app </w:t>
+            </w:r>
+            <w:hyperlink r:id="rHl19">
+              <w:r>
+                <w:rPr>
+                  <w:rStyle w:val="Hyperlink"/>
+                  <w:sz w:val="18"/>
+                </w:rPr>
+                <w:t xml:space="preserve">A Little Picky?</w:t>
+              </w:r>
+            </w:hyperlink>
+            <w:r>
+              <w:rPr>
+                <w:sz w:val="18"/>
+              </w:rPr>
+              <w:t xml:space="preserve">.</w:t>
+            </w:r>
+          </w:p>
+        </w:tc>
+        <w:tc>
+          <w:tcPr>
+            <w:tcW w:w="1680" w:type="dxa"/>
+          </w:tcPr>
+          <w:p>
+            <w:pPr>
+              <w:spacing w:before="40" w:after="40"/>
+            </w:pPr>
+            <w:r>
+              <w:rPr>
+                <w:b/>
+                <w:sz w:val="18"/>
+              </w:rPr>
+              <w:t xml:space="preserve">High.</w:t>
+            </w:r>
+            <w:r>
+              <w:rPr>
+                <w:sz w:val="18"/>
+              </w:rPr>
+              <w:t xml:space="preserve"> This is close to the same goods.</w:t>
+            </w:r>
+          </w:p>
+        </w:tc>
+      </w:tr>
+      <w:tr>
+        <w:tc>
+          <w:tcPr>
+            <w:tcW w:w="1680" w:type="dxa"/>
+          </w:tcPr>
+          <w:p>
+            <w:pPr>
+              <w:spacing w:before="40" w:after="40"/>
+            </w:pPr>
+            <w:r>
+              <w:rPr>
+                <w:b/>
+                <w:sz w:val="18"/>
+              </w:rPr>
+              <w:t xml:space="preserve">PICKY CHEFS</w:t>
+            </w:r>
+          </w:p>
+        </w:tc>
+        <w:tc>
+          <w:tcPr>
+            <w:tcW w:w="1680" w:type="dxa"/>
+          </w:tcPr>
+          <w:p>
+            <w:pPr>
+              <w:spacing w:before="40" w:after="40"/>
+            </w:pPr>
+            <w:r>
+              <w:rPr>
+                <w:sz w:val="18"/>
+              </w:rPr>
+              <w:t xml:space="preserve">9, 43</w:t>
+            </w:r>
+          </w:p>
+        </w:tc>
+        <w:tc>
+          <w:tcPr>
+            <w:tcW w:w="1680" w:type="dxa"/>
+          </w:tcPr>
+          <w:p>
+            <w:pPr>
+              <w:spacing w:before="40" w:after="40"/>
+            </w:pPr>
+            <w:r>
+              <w:rPr>
+                <w:sz w:val="18"/>
+              </w:rPr>
+              <w:t xml:space="preserve">Marios and Kristina Kourasis</w:t>
+            </w:r>
+          </w:p>
+        </w:tc>
+        <w:tc>
+          <w:tcPr>
+            <w:tcW w:w="1680" w:type="dxa"/>
+          </w:tcPr>
+          <w:p>
+            <w:pPr>
+              <w:spacing w:before="40" w:after="40"/>
+            </w:pPr>
+            <w:r>
+              <w:rPr>
+                <w:sz w:val="18"/>
+              </w:rPr>
+              <w:t xml:space="preserve">Recipe, meal-planning and grocery-list apps, and AI recipe suggestions</w:t>
+            </w:r>
+          </w:p>
+        </w:tc>
+        <w:tc>
+          <w:tcPr>
+            <w:tcW w:w="1680" w:type="dxa"/>
+          </w:tcPr>
+          <w:p>
+            <w:pPr>
+              <w:spacing w:before="40" w:after="40"/>
+            </w:pPr>
+            <w:r>
+              <w:rPr>
+                <w:sz w:val="18"/>
+              </w:rPr>
+              <w:t xml:space="preserve">Pending (filed 2025-03-15), currently suspended. It's tied to the </w:t>
+            </w:r>
+            <w:hyperlink r:id="rHl17">
+              <w:r>
+                <w:rPr>
+                  <w:rStyle w:val="Hyperlink"/>
+                  <w:sz w:val="18"/>
+                </w:rPr>
+                <w:t xml:space="preserve">Picky Chefs</w:t>
+              </w:r>
+            </w:hyperlink>
+            <w:r>
+              <w:rPr>
+                <w:sz w:val="18"/>
+              </w:rPr>
+              <w:t xml:space="preserve"> app.</w:t>
+            </w:r>
+          </w:p>
+        </w:tc>
+        <w:tc>
+          <w:tcPr>
+            <w:tcW w:w="1680" w:type="dxa"/>
+          </w:tcPr>
+          <w:p>
+            <w:pPr>
+              <w:spacing w:before="40" w:after="40"/>
+            </w:pPr>
+            <w:r>
+              <w:rPr>
+                <w:b/>
+                <w:sz w:val="18"/>
+              </w:rPr>
+              <w:t xml:space="preserve">High.</w:t>
+            </w:r>
+            <w:r>
+              <w:rPr>
+                <w:sz w:val="18"/>
+              </w:rPr>
+              <w:t xml:space="preserve"> It overlaps on meal plans and grocery lists.</w:t>
+            </w:r>
+          </w:p>
+        </w:tc>
+      </w:tr>
+      <w:tr>
+        <w:tc>
+          <w:tcPr>
+            <w:tcW w:w="1680" w:type="dxa"/>
+          </w:tcPr>
+          <w:p>
+            <w:pPr>
+              <w:spacing w:before="40" w:after="40"/>
+            </w:pPr>
+            <w:r>
+              <w:rPr>
+                <w:sz w:val="18"/>
+              </w:rPr>
+              <w:t xml:space="preserve">PICKY</w:t>
+            </w:r>
+          </w:p>
+        </w:tc>
+        <w:tc>
+          <w:tcPr>
+            <w:tcW w:w="1680" w:type="dxa"/>
+          </w:tcPr>
+          <w:p>
+            <w:pPr>
+              <w:spacing w:before="40" w:after="40"/>
+            </w:pPr>
+            <w:r>
+              <w:rPr>
+                <w:sz w:val="18"/>
+              </w:rPr>
+              <w:t xml:space="preserve">9, 3</w:t>
+            </w:r>
+          </w:p>
+        </w:tc>
+        <w:tc>
+          <w:tcPr>
+            <w:tcW w:w="1680" w:type="dxa"/>
+          </w:tcPr>
+          <w:p>
+            <w:pPr>
+              <w:spacing w:before="40" w:after="40"/>
+            </w:pPr>
+            <w:r>
+              <w:rPr>
+                <w:sz w:val="18"/>
+              </w:rPr>
+              <w:t xml:space="preserve">Picky Inc. (Korea)</w:t>
+            </w:r>
+          </w:p>
+        </w:tc>
+        <w:tc>
+          <w:tcPr>
+            <w:tcW w:w="1680" w:type="dxa"/>
+          </w:tcPr>
+          <w:p>
+            <w:pPr>
+              <w:spacing w:before="40" w:after="40"/>
+            </w:pPr>
+            <w:r>
+              <w:rPr>
+                <w:sz w:val="18"/>
+              </w:rPr>
+              <w:t xml:space="preserve">The K-beauty app </w:t>
+            </w:r>
+            <w:hyperlink r:id="rHl20">
+              <w:r>
+                <w:rPr>
+                  <w:rStyle w:val="Hyperlink"/>
+                  <w:sz w:val="18"/>
+                </w:rPr>
+                <w:t xml:space="preserve">Picky</w:t>
+              </w:r>
+            </w:hyperlink>
+          </w:p>
+        </w:tc>
+        <w:tc>
+          <w:tcPr>
+            <w:tcW w:w="1680" w:type="dxa"/>
+          </w:tcPr>
+          <w:p>
+            <w:pPr>
+              <w:spacing w:before="40" w:after="40"/>
+            </w:pPr>
+            <w:r>
+              <w:rPr>
+                <w:sz w:val="18"/>
+              </w:rPr>
+              <w:t xml:space="preserve">Live</w:t>
+            </w:r>
+          </w:p>
+        </w:tc>
+        <w:tc>
+          <w:tcPr>
+            <w:tcW w:w="1680" w:type="dxa"/>
+          </w:tcPr>
+          <w:p>
+            <w:pPr>
+              <w:spacing w:before="40" w:after="40"/>
+            </w:pPr>
+            <w:r>
+              <w:rPr>
+                <w:sz w:val="18"/>
+              </w:rPr>
+              <w:t xml:space="preserve">Low. It's a different market, but the owner holds PICKY alone in class 9.</w:t>
+            </w:r>
+          </w:p>
+        </w:tc>
+      </w:tr>
+      <w:tr>
+        <w:tc>
+          <w:tcPr>
+            <w:tcW w:w="1680" w:type="dxa"/>
+          </w:tcPr>
+          <w:p>
+            <w:pPr>
+              <w:spacing w:before="40" w:after="40"/>
+            </w:pPr>
+            <w:r>
+              <w:rPr>
+                <w:sz w:val="18"/>
+              </w:rPr>
+              <w:t xml:space="preserve">PICKY PLATES</w:t>
+            </w:r>
+          </w:p>
+        </w:tc>
+        <w:tc>
+          <w:tcPr>
+            <w:tcW w:w="1680" w:type="dxa"/>
+          </w:tcPr>
+          <w:p>
+            <w:pPr>
+              <w:spacing w:before="40" w:after="40"/>
+            </w:pPr>
+            <w:r>
+              <w:rPr>
+                <w:sz w:val="18"/>
+              </w:rPr>
+              <w:t xml:space="preserve">9, 41</w:t>
+            </w:r>
+          </w:p>
+        </w:tc>
+        <w:tc>
+          <w:tcPr>
+            <w:tcW w:w="1680" w:type="dxa"/>
+          </w:tcPr>
+          <w:p>
+            <w:pPr>
+              <w:spacing w:before="40" w:after="40"/>
+            </w:pPr>
+            <w:r>
+              <w:rPr>
+                <w:sz w:val="18"/>
+              </w:rPr>
+              <w:t xml:space="preserve">Nutrition for Littles LLC</w:t>
+            </w:r>
+          </w:p>
+        </w:tc>
+        <w:tc>
+          <w:tcPr>
+            <w:tcW w:w="1680" w:type="dxa"/>
+          </w:tcPr>
+          <w:p>
+            <w:pPr>
+              <w:spacing w:before="40" w:after="40"/>
+            </w:pPr>
+            <w:r>
+              <w:rPr>
+                <w:sz w:val="18"/>
+              </w:rPr>
+              <w:t xml:space="preserve">The family meal-planning app </w:t>
+            </w:r>
+            <w:hyperlink r:id="rHl21">
+              <w:r>
+                <w:rPr>
+                  <w:rStyle w:val="Hyperlink"/>
+                  <w:sz w:val="18"/>
+                </w:rPr>
+                <w:t xml:space="preserve">Picky Plates</w:t>
+              </w:r>
+            </w:hyperlink>
+          </w:p>
+        </w:tc>
+        <w:tc>
+          <w:tcPr>
+            <w:tcW w:w="1680" w:type="dxa"/>
+          </w:tcPr>
+          <w:p>
+            <w:pPr>
+              <w:spacing w:before="40" w:after="40"/>
+            </w:pPr>
+            <w:r>
+              <w:rPr>
+                <w:sz w:val="18"/>
+              </w:rPr>
+              <w:t xml:space="preserve">Live</w:t>
+            </w:r>
+          </w:p>
+        </w:tc>
+        <w:tc>
+          <w:tcPr>
+            <w:tcW w:w="1680" w:type="dxa"/>
+          </w:tcPr>
+          <w:p>
+            <w:pPr>
+              <w:spacing w:before="40" w:after="40"/>
+            </w:pPr>
+            <w:r>
+              <w:rPr>
+                <w:sz w:val="18"/>
+              </w:rPr>
+              <w:t xml:space="preserve">Medium</w:t>
+            </w:r>
+          </w:p>
+        </w:tc>
+      </w:tr>
+      <w:tr>
+        <w:tc>
+          <w:tcPr>
+            <w:tcW w:w="1680" w:type="dxa"/>
+          </w:tcPr>
+          <w:p>
+            <w:pPr>
+              <w:spacing w:before="40" w:after="40"/>
+            </w:pPr>
+            <w:r>
+              <w:rPr>
+                <w:sz w:val="18"/>
+              </w:rPr>
+              <w:t xml:space="preserve">PICKY BARS</w:t>
+            </w:r>
+          </w:p>
+        </w:tc>
+        <w:tc>
+          <w:tcPr>
+            <w:tcW w:w="1680" w:type="dxa"/>
+          </w:tcPr>
+          <w:p>
+            <w:pPr>
+              <w:spacing w:before="40" w:after="40"/>
+            </w:pPr>
+            <w:r>
+              <w:rPr>
+                <w:sz w:val="18"/>
+              </w:rPr>
+              <w:t xml:space="preserve">29, 30</w:t>
+            </w:r>
+          </w:p>
+        </w:tc>
+        <w:tc>
+          <w:tcPr>
+            <w:tcW w:w="1680" w:type="dxa"/>
+          </w:tcPr>
+          <w:p>
+            <w:pPr>
+              <w:spacing w:before="40" w:after="40"/>
+            </w:pPr>
+            <w:r>
+              <w:rPr>
+                <w:sz w:val="18"/>
+              </w:rPr>
+              <w:t xml:space="preserve">Picky Bars</w:t>
+            </w:r>
+          </w:p>
+        </w:tc>
+        <w:tc>
+          <w:tcPr>
+            <w:tcW w:w="1680" w:type="dxa"/>
+          </w:tcPr>
+          <w:p>
+            <w:pPr>
+              <w:spacing w:before="40" w:after="40"/>
+            </w:pPr>
+            <w:r>
+              <w:rPr>
+                <w:sz w:val="18"/>
+              </w:rPr>
+              <w:t xml:space="preserve">Snack and food bars</w:t>
+            </w:r>
+          </w:p>
+        </w:tc>
+        <w:tc>
+          <w:tcPr>
+            <w:tcW w:w="1680" w:type="dxa"/>
+          </w:tcPr>
+          <w:p>
+            <w:pPr>
+              <w:spacing w:before="40" w:after="40"/>
+            </w:pPr>
+            <w:r>
+              <w:rPr>
+                <w:sz w:val="18"/>
+              </w:rPr>
+              <w:t xml:space="preserve">Registered</w:t>
+            </w:r>
+          </w:p>
+        </w:tc>
+        <w:tc>
+          <w:tcPr>
+            <w:tcW w:w="1680" w:type="dxa"/>
+          </w:tcPr>
+          <w:p>
+            <w:pPr>
+              <w:spacing w:before="40" w:after="40"/>
+            </w:pPr>
+            <w:r>
+              <w:rPr>
+                <w:sz w:val="18"/>
+              </w:rPr>
+              <w:t xml:space="preserve">Low for an app, higher if PickyFoods ever sells its own food</w:t>
+            </w:r>
+          </w:p>
+        </w:tc>
+      </w:tr>
+      <w:tr>
+        <w:tc>
+          <w:tcPr>
+            <w:tcW w:w="1680" w:type="dxa"/>
+          </w:tcPr>
+          <w:p>
+            <w:pPr>
+              <w:spacing w:before="40" w:after="40"/>
+            </w:pPr>
+            <w:r>
+              <w:rPr>
+                <w:sz w:val="18"/>
+              </w:rPr>
+              <w:t xml:space="preserve">PICKY EATER</w:t>
+            </w:r>
+          </w:p>
+        </w:tc>
+        <w:tc>
+          <w:tcPr>
+            <w:tcW w:w="1680" w:type="dxa"/>
+          </w:tcPr>
+          <w:p>
+            <w:pPr>
+              <w:spacing w:before="40" w:after="40"/>
+            </w:pPr>
+            <w:r>
+              <w:rPr>
+                <w:sz w:val="18"/>
+              </w:rPr>
+              <w:t xml:space="preserve">30</w:t>
+            </w:r>
+          </w:p>
+        </w:tc>
+        <w:tc>
+          <w:tcPr>
+            <w:tcW w:w="1680" w:type="dxa"/>
+          </w:tcPr>
+          <w:p>
+            <w:pPr>
+              <w:spacing w:before="40" w:after="40"/>
+            </w:pPr>
+            <w:r>
+              <w:rPr>
+                <w:sz w:val="18"/>
+              </w:rPr>
+              <w:t xml:space="preserve">H Mart Companies</w:t>
+            </w:r>
+          </w:p>
+        </w:tc>
+        <w:tc>
+          <w:tcPr>
+            <w:tcW w:w="1680" w:type="dxa"/>
+          </w:tcPr>
+          <w:p>
+            <w:pPr>
+              <w:spacing w:before="40" w:after="40"/>
+            </w:pPr>
+            <w:r>
+              <w:rPr>
+                <w:sz w:val="18"/>
+              </w:rPr>
+              <w:t xml:space="preserve">Food products</w:t>
+            </w:r>
+          </w:p>
+        </w:tc>
+        <w:tc>
+          <w:tcPr>
+            <w:tcW w:w="1680" w:type="dxa"/>
+          </w:tcPr>
+          <w:p>
+            <w:pPr>
+              <w:spacing w:before="40" w:after="40"/>
+            </w:pPr>
+            <w:r>
+              <w:rPr>
+                <w:sz w:val="18"/>
+              </w:rPr>
+              <w:t xml:space="preserve">Live</w:t>
+            </w:r>
+          </w:p>
+        </w:tc>
+        <w:tc>
+          <w:tcPr>
+            <w:tcW w:w="1680" w:type="dxa"/>
+          </w:tcPr>
+          <w:p>
+            <w:pPr>
+              <w:spacing w:before="40" w:after="40"/>
+            </w:pPr>
+            <w:r>
+              <w:rPr>
+                <w:sz w:val="18"/>
+              </w:rPr>
+              <w:t xml:space="preserve">Low for an app</w:t>
+            </w:r>
+          </w:p>
+        </w:tc>
+      </w:tr>
+    </w:tbl>
+    <w:p>
+      <w:pPr>
+        <w:spacing w:after="0"/>
+      </w:pPr>
+    </w:p>
+    <w:p>
+      <w:r>
+        <w:t xml:space="preserve">Sources: </w:t>
+      </w:r>
+      <w:hyperlink r:id="rHl3">
+        <w:r>
+          <w:rPr>
+            <w:rStyle w:val="Hyperlink"/>
+          </w:rPr>
+          <w:t xml:space="preserve">USPTO Trademark Search</w:t>
+        </w:r>
+      </w:hyperlink>
+      <w:r>
+        <w:t xml:space="preserve">, </w:t>
+      </w:r>
+      <w:hyperlink r:id="rHl22">
+        <w:r>
+          <w:rPr>
+            <w:rStyle w:val="Hyperlink"/>
+          </w:rPr>
+          <w:t xml:space="preserve">Justia listing for the Picky Chefs owners</w:t>
+        </w:r>
+      </w:hyperlink>
+      <w:r>
+        <w:t xml:space="preserve">.</w:t>
+      </w:r>
+    </w:p>
+    <w:p>
+      <w:pPr>
+        <w:pStyle w:val="Heading1"/>
+      </w:pPr>
+      <w:r>
+        <w:t xml:space="preserve">Food and diet apps already using "Picky"</w:t>
+      </w:r>
+    </w:p>
+    <w:p>
+      <w:r>
+        <w:t xml:space="preserve">On the US App Store, a search for "picky" turned up 22 apps with Picky in the title. These are the ones in the same space (</w:t>
+      </w:r>
+      <w:hyperlink r:id="rHl23">
+        <w:r>
+          <w:rPr>
+            <w:rStyle w:val="Hyperlink"/>
+          </w:rPr>
+          <w:t xml:space="preserve">iTunes Search API</w:t>
+        </w:r>
+      </w:hyperlink>
+      <w:r>
+        <w:t xml:space="preserve">):</w:t>
+      </w:r>
+    </w:p>
+    <w:p>
+      <w:pPr>
+        <w:numPr>
+          <w:ilvl w:val="0"/>
+          <w:numId w:val="1"/>
+        </w:numPr>
+      </w:pPr>
+      <w:hyperlink r:id="rHl24">
+        <w:r>
+          <w:rPr>
+            <w:rStyle w:val="Hyperlink"/>
+          </w:rPr>
+          <w:t xml:space="preserve">Eat Picky</w:t>
+        </w:r>
+      </w:hyperlink>
+      <w:r>
+        <w:t xml:space="preserve"> (Health &amp; Fitness, released 2026-03-26) is a food-allergy app with a barcode scanner and AI scanning.</w:t>
+      </w:r>
+    </w:p>
+    <w:p>
+      <w:pPr>
+        <w:numPr>
+          <w:ilvl w:val="0"/>
+          <w:numId w:val="1"/>
+        </w:numPr>
+      </w:pPr>
+      <w:hyperlink r:id="rHl25">
+        <w:r>
+          <w:rPr>
+            <w:rStyle w:val="Hyperlink"/>
+          </w:rPr>
+          <w:t xml:space="preserve">Picky - What's for dinner?</w:t>
+        </w:r>
+      </w:hyperlink>
+      <w:r>
+        <w:t xml:space="preserve"> lets users swipe through recipes and match on what to eat. It has been on the store since 2021.</w:t>
+      </w:r>
+    </w:p>
+    <w:p>
+      <w:pPr>
+        <w:numPr>
+          <w:ilvl w:val="0"/>
+          <w:numId w:val="1"/>
+        </w:numPr>
+      </w:pPr>
+      <w:hyperlink r:id="rHl26">
+        <w:r>
+          <w:rPr>
+            <w:rStyle w:val="Hyperlink"/>
+          </w:rPr>
+          <w:t xml:space="preserve">Picky - Grocery Shopping List</w:t>
+        </w:r>
+      </w:hyperlink>
+      <w:r>
+        <w:t xml:space="preserve"> is a grocery list app that has been on the store since 2017.</w:t>
+      </w:r>
+    </w:p>
+    <w:p>
+      <w:pPr>
+        <w:numPr>
+          <w:ilvl w:val="0"/>
+          <w:numId w:val="1"/>
+        </w:numPr>
+      </w:pPr>
+      <w:hyperlink r:id="rHl27">
+        <w:r>
+          <w:rPr>
+            <w:rStyle w:val="Hyperlink"/>
+          </w:rPr>
+          <w:t xml:space="preserve">Picky - Safe Eating</w:t>
+        </w:r>
+      </w:hyperlink>
+      <w:r>
+        <w:t xml:space="preserve"> reads restaurant menus for people with allergies. It was released in September 2026.</w:t>
+      </w:r>
+    </w:p>
+    <w:p>
+      <w:pPr>
+        <w:numPr>
+          <w:ilvl w:val="0"/>
+          <w:numId w:val="1"/>
+        </w:numPr>
+      </w:pPr>
+      <w:hyperlink r:id="rHl21">
+        <w:r>
+          <w:rPr>
+            <w:rStyle w:val="Hyperlink"/>
+          </w:rPr>
+          <w:t xml:space="preserve">Picky Plates</w:t>
+        </w:r>
+      </w:hyperlink>
+      <w:r>
+        <w:t xml:space="preserve"> and </w:t>
+      </w:r>
+      <w:hyperlink r:id="rHl28">
+        <w:r>
+          <w:rPr>
+            <w:rStyle w:val="Hyperlink"/>
+          </w:rPr>
+          <w:t xml:space="preserve">EatPal: Picky Eater Meal Plans</w:t>
+        </w:r>
+      </w:hyperlink>
+      <w:r>
+        <w:t xml:space="preserve"> are meal planners with grocery lists for families with picky children.</w:t>
+      </w:r>
+    </w:p>
+    <w:p>
+      <w:pPr>
+        <w:numPr>
+          <w:ilvl w:val="0"/>
+          <w:numId w:val="1"/>
+        </w:numPr>
+      </w:pPr>
+      <w:hyperlink r:id="rHl29">
+        <w:r>
+          <w:rPr>
+            <w:rStyle w:val="Hyperlink"/>
+          </w:rPr>
+          <w:t xml:space="preserve">PickyEatrs</w:t>
+        </w:r>
+      </w:hyperlink>
+      <w:r>
+        <w:t xml:space="preserve">, </w:t>
+      </w:r>
+      <w:hyperlink r:id="rHl19">
+        <w:r>
+          <w:rPr>
+            <w:rStyle w:val="Hyperlink"/>
+          </w:rPr>
+          <w:t xml:space="preserve">A Little Picky?</w:t>
+        </w:r>
+      </w:hyperlink>
+      <w:r>
+        <w:t xml:space="preserve"> and </w:t>
+      </w:r>
+      <w:hyperlink r:id="rHl30">
+        <w:r>
+          <w:rPr>
+            <w:rStyle w:val="Hyperlink"/>
+          </w:rPr>
+          <w:t xml:space="preserve">PickyPlaces</w:t>
+        </w:r>
+      </w:hyperlink>
+      <w:r>
+        <w:t xml:space="preserve"> are also in Food &amp; Drink.</w:t>
+      </w:r>
+    </w:p>
+    <w:p>
+      <w:r>
+        <w:t xml:space="preserve">On Google Play, a search for "picky food" turned up the package IDs </w:t>
+      </w:r>
+      <w:r>
+        <w:rPr>
+          <w:rFonts w:ascii="Consolas" w:hAnsi="Consolas"/>
+        </w:rPr>
+        <w:t xml:space="preserve">recipes.picky.app</w:t>
+      </w:r>
+      <w:r>
+        <w:t xml:space="preserve">, </w:t>
+      </w:r>
+      <w:r>
+        <w:rPr>
+          <w:rFonts w:ascii="Consolas" w:hAnsi="Consolas"/>
+        </w:rPr>
+        <w:t xml:space="preserve">com.pickycode.pickyeats</w:t>
+      </w:r>
+      <w:r>
+        <w:t xml:space="preserve"> and </w:t>
+      </w:r>
+      <w:r>
+        <w:rPr>
+          <w:rFonts w:ascii="Consolas" w:hAnsi="Consolas"/>
+        </w:rPr>
+        <w:t xml:space="preserve">com.pickychefs.app</w:t>
+      </w:r>
+      <w:r>
+        <w:t xml:space="preserve"> (</w:t>
+      </w:r>
+      <w:hyperlink r:id="rHl31">
+        <w:r>
+          <w:rPr>
+            <w:rStyle w:val="Hyperlink"/>
+          </w:rPr>
+          <w:t xml:space="preserve">Play Store search</w:t>
+        </w:r>
+      </w:hyperlink>
+      <w:r>
+        <w:t xml:space="preserve">).</w:t>
+      </w:r>
+    </w:p>
+    <w:p>
+      <w:pPr>
+        <w:pStyle w:val="Heading1"/>
+      </w:pPr>
+      <w:r>
+        <w:t xml:space="preserve">What this means for the name</w:t>
+      </w:r>
+    </w:p>
+    <w:p>
+      <w:pPr>
+        <w:numPr>
+          <w:ilvl w:val="0"/>
+          <w:numId w:val="1"/>
+        </w:numPr>
+      </w:pPr>
+      <w:r>
+        <w:rPr>
+          <w:b/>
+        </w:rPr>
+        <w:t xml:space="preserve">Search and app-store discovery:</w:t>
+      </w:r>
+      <w:r>
+        <w:t xml:space="preserve"> someone searching "Picky" for this app would find 20 or more others first.</w:t>
+      </w:r>
+    </w:p>
+    <w:p>
+      <w:pPr>
+        <w:numPr>
+          <w:ilvl w:val="0"/>
+          <w:numId w:val="1"/>
+        </w:numPr>
+      </w:pPr>
+      <w:r>
+        <w:rPr>
+          <w:b/>
+        </w:rPr>
+        <w:t xml:space="preserve">Trademark:</w:t>
+      </w:r>
+      <w:r>
+        <w:t xml:space="preserve"> an application for PICKYFOODS in class 9 would probably be compared with the PICKY? and PICKY CHEFS applications that were filed earlier. "Foods" adds nothing an examiner can rely on to tell them apart.</w:t>
+      </w:r>
+    </w:p>
+    <w:p>
+      <w:pPr>
+        <w:numPr>
+          <w:ilvl w:val="0"/>
+          <w:numId w:val="1"/>
+        </w:numPr>
+      </w:pPr>
+      <w:r>
+        <w:rPr>
+          <w:b/>
+        </w:rPr>
+        <w:t xml:space="preserve">Positioning:</w:t>
+      </w:r>
+      <w:r>
+        <w:t xml:space="preserve"> across the App Store, "picky" means picky eaters, kids and allergies. The product's buyers are adults losing weight, many on GLP-1s. The name points them at the wrong use.</w:t>
+      </w:r>
+    </w:p>
+    <w:p>
+      <w:pPr>
+        <w:numPr>
+          <w:ilvl w:val="0"/>
+          <w:numId w:val="1"/>
+        </w:numPr>
+      </w:pPr>
+      <w:r>
+        <w:rPr>
+          <w:b/>
+        </w:rPr>
+        <w:t xml:space="preserve">Domain:</w:t>
+      </w:r>
+      <w:r>
+        <w:t xml:space="preserve"> the .com has been held for 10 years and is renewed through 2031. Buying it would mean tracking down the owner and paying an unknown price. Launching on pickyfoods.app or getpickyfoods.com would work.</w:t>
+      </w:r>
+    </w:p>
+    <w:p>
+      <w:pPr>
+        <w:pStyle w:val="Heading1"/>
+      </w:pPr>
+      <w:r>
+        <w:t xml:space="preserve">What could not be verified</w:t>
+      </w:r>
+    </w:p>
+    <w:p>
+      <w:pPr>
+        <w:numPr>
+          <w:ilvl w:val="0"/>
+          <w:numId w:val="1"/>
+        </w:numPr>
+      </w:pPr>
+      <w:r>
+        <w:rPr>
+          <w:b/>
+        </w:rPr>
+        <w:t xml:space="preserve">Who owns pickyfoods.com, and whether it's for sale:</w:t>
+      </w:r>
+      <w:r>
+        <w:t xml:space="preserve"> the registrant is hidden behind GoDaddy privacy.</w:t>
+      </w:r>
+    </w:p>
+    <w:p>
+      <w:pPr>
+        <w:numPr>
+          <w:ilvl w:val="0"/>
+          <w:numId w:val="1"/>
+        </w:numPr>
+      </w:pPr>
+      <w:r>
+        <w:rPr>
+          <w:b/>
+        </w:rPr>
+        <w:t xml:space="preserve">The outcome of the PICKY? and PICKY CHEFS applications:</w:t>
+      </w:r>
+      <w:r>
+        <w:t xml:space="preserve"> both are pending, and either could still be abandoned or refused.</w:t>
+      </w:r>
+    </w:p>
+    <w:p>
+      <w:pPr>
+        <w:numPr>
+          <w:ilvl w:val="0"/>
+          <w:numId w:val="1"/>
+        </w:numPr>
+      </w:pPr>
+      <w:r>
+        <w:rPr>
+          <w:b/>
+        </w:rPr>
+        <w:t xml:space="preserve">State trademarks, common-law use, foreign marks, non-US app stores and social handles:</w:t>
+      </w:r>
+      <w:r>
+        <w:t xml:space="preserve"> not checked. The same limits as the first screen apply.</w:t>
+      </w:r>
+    </w:p>
+    <w:p>
+      <w:pPr>
+        <w:numPr>
+          <w:ilvl w:val="0"/>
+          <w:numId w:val="1"/>
+        </w:numPr>
+      </w:pPr>
+      <w:r>
+        <w:rPr>
+          <w:b/>
+        </w:rPr>
+        <w:t xml:space="preserve">Google Play titles:</w:t>
+      </w:r>
+      <w:r>
+        <w:t xml:space="preserve"> the exact-name check found nothing. The broader "picky food" Play search was read only from package IDs, not full listings.</w:t>
+      </w:r>
     </w:p>
     <w:sectPr>
       <w:pgSz w:w="12240" w:h="15840"/>

</xml_diff>